<commit_message>
Overhaul: Implemented Cyberpunk TUI dashboard with A* frontiers, chroma-depth, and moving hazards
</commit_message>
<xml_diff>
--- a/Robot Navigation with Obstacle Avoidance.docx
+++ b/Robot Navigation with Obstacle Avoidance.docx
@@ -26726,303 +26726,1303 @@
           <w:lang w:val="en-US"/>
         </w:rPr>
       </w:pPr>
-    </w:p>
-    <w:p>
-      <w:pPr>
-        <w:jc w:val="left"/>
-        <w:rPr>
-          <w:rFonts w:ascii="Times New Roman" w:hAnsi="Times New Roman" w:cs="Times New Roman"/>
-          <w:sz w:val="24"/>
-          <w:szCs w:val="24"/>
-          <w:lang w:val="en-US"/>
-        </w:rPr>
-      </w:pPr>
-    </w:p>
-    <w:p>
-      <w:pPr>
-        <w:jc w:val="left"/>
-        <w:rPr>
-          <w:rFonts w:ascii="Times New Roman" w:hAnsi="Times New Roman" w:cs="Times New Roman"/>
-          <w:sz w:val="24"/>
-          <w:szCs w:val="24"/>
-          <w:lang w:val="en-US"/>
-        </w:rPr>
-      </w:pPr>
-    </w:p>
-    <w:p>
-      <w:pPr>
-        <w:jc w:val="left"/>
-        <w:rPr>
-          <w:rFonts w:ascii="Times New Roman" w:hAnsi="Times New Roman" w:cs="Times New Roman"/>
-          <w:sz w:val="24"/>
-          <w:szCs w:val="24"/>
-          <w:lang w:val="en-US"/>
-        </w:rPr>
-      </w:pPr>
-    </w:p>
-    <w:p>
-      <w:pPr>
-        <w:jc w:val="left"/>
-        <w:rPr>
-          <w:rFonts w:ascii="Times New Roman" w:hAnsi="Times New Roman" w:cs="Times New Roman"/>
-          <w:sz w:val="24"/>
-          <w:szCs w:val="24"/>
-          <w:lang w:val="en-US"/>
-        </w:rPr>
-      </w:pPr>
-    </w:p>
-    <w:p>
-      <w:pPr>
-        <w:jc w:val="left"/>
-        <w:rPr>
-          <w:rFonts w:ascii="Times New Roman" w:hAnsi="Times New Roman" w:cs="Times New Roman"/>
-          <w:sz w:val="24"/>
-          <w:szCs w:val="24"/>
-          <w:lang w:val="en-US"/>
-        </w:rPr>
-      </w:pPr>
-    </w:p>
-    <w:p>
-      <w:pPr>
-        <w:jc w:val="left"/>
-        <w:rPr>
-          <w:rFonts w:ascii="Times New Roman" w:hAnsi="Times New Roman" w:cs="Times New Roman"/>
-          <w:sz w:val="24"/>
-          <w:szCs w:val="24"/>
-          <w:lang w:val="en-US"/>
-        </w:rPr>
-      </w:pPr>
-    </w:p>
-    <w:p>
-      <w:pPr>
-        <w:jc w:val="left"/>
-        <w:rPr>
-          <w:rFonts w:ascii="Times New Roman" w:hAnsi="Times New Roman" w:cs="Times New Roman"/>
-          <w:sz w:val="24"/>
-          <w:szCs w:val="24"/>
-          <w:lang w:val="en-US"/>
-        </w:rPr>
-      </w:pPr>
-    </w:p>
-    <w:p>
-      <w:pPr>
-        <w:jc w:val="left"/>
-        <w:rPr>
-          <w:rFonts w:ascii="Times New Roman" w:hAnsi="Times New Roman" w:cs="Times New Roman"/>
-          <w:sz w:val="24"/>
-          <w:szCs w:val="24"/>
-          <w:lang w:val="en-US"/>
-        </w:rPr>
-      </w:pPr>
-    </w:p>
-    <w:p>
-      <w:pPr>
-        <w:jc w:val="left"/>
-        <w:rPr>
-          <w:rFonts w:ascii="Times New Roman" w:hAnsi="Times New Roman" w:cs="Times New Roman"/>
-          <w:sz w:val="24"/>
-          <w:szCs w:val="24"/>
-          <w:lang w:val="en-US"/>
-        </w:rPr>
-      </w:pPr>
-    </w:p>
-    <w:p>
-      <w:pPr>
-        <w:jc w:val="left"/>
-        <w:rPr>
-          <w:rFonts w:ascii="Times New Roman" w:hAnsi="Times New Roman" w:cs="Times New Roman"/>
-          <w:sz w:val="24"/>
-          <w:szCs w:val="24"/>
-          <w:lang w:val="en-US"/>
-        </w:rPr>
-      </w:pPr>
-    </w:p>
-    <w:p>
-      <w:pPr>
-        <w:jc w:val="left"/>
-        <w:rPr>
-          <w:rFonts w:ascii="Times New Roman" w:hAnsi="Times New Roman" w:cs="Times New Roman"/>
-          <w:sz w:val="24"/>
-          <w:szCs w:val="24"/>
-          <w:lang w:val="en-US"/>
-        </w:rPr>
-      </w:pPr>
-    </w:p>
-    <w:p>
-      <w:pPr>
-        <w:jc w:val="left"/>
-        <w:rPr>
-          <w:rFonts w:ascii="Times New Roman" w:hAnsi="Times New Roman" w:cs="Times New Roman"/>
-          <w:sz w:val="24"/>
-          <w:szCs w:val="24"/>
-          <w:lang w:val="en-US"/>
-        </w:rPr>
-      </w:pPr>
-    </w:p>
-    <w:p>
-      <w:pPr>
-        <w:jc w:val="left"/>
-        <w:rPr>
-          <w:rFonts w:ascii="Times New Roman" w:hAnsi="Times New Roman" w:cs="Times New Roman"/>
-          <w:sz w:val="24"/>
-          <w:szCs w:val="24"/>
-          <w:lang w:val="en-US"/>
-        </w:rPr>
-      </w:pPr>
-    </w:p>
-    <w:p>
-      <w:pPr>
-        <w:jc w:val="left"/>
-        <w:rPr>
-          <w:rFonts w:ascii="Times New Roman" w:hAnsi="Times New Roman" w:cs="Times New Roman"/>
-          <w:sz w:val="24"/>
-          <w:szCs w:val="24"/>
-          <w:lang w:val="en-US"/>
-        </w:rPr>
-      </w:pPr>
-    </w:p>
-    <w:p>
-      <w:pPr>
-        <w:jc w:val="left"/>
-        <w:rPr>
-          <w:rFonts w:ascii="Times New Roman" w:hAnsi="Times New Roman" w:cs="Times New Roman"/>
-          <w:sz w:val="24"/>
-          <w:szCs w:val="24"/>
-          <w:lang w:val="en-US"/>
-        </w:rPr>
-      </w:pPr>
-    </w:p>
-    <w:p>
-      <w:pPr>
-        <w:jc w:val="left"/>
-        <w:rPr>
-          <w:rFonts w:ascii="Times New Roman" w:hAnsi="Times New Roman" w:cs="Times New Roman"/>
-          <w:sz w:val="24"/>
-          <w:szCs w:val="24"/>
-          <w:lang w:val="en-US"/>
-        </w:rPr>
-      </w:pPr>
-    </w:p>
-    <w:p>
-      <w:pPr>
-        <w:jc w:val="left"/>
-        <w:rPr>
-          <w:rFonts w:ascii="Times New Roman" w:hAnsi="Times New Roman" w:cs="Times New Roman"/>
-          <w:sz w:val="24"/>
-          <w:szCs w:val="24"/>
-          <w:lang w:val="en-US"/>
-        </w:rPr>
-      </w:pPr>
-    </w:p>
-    <w:p>
-      <w:pPr>
-        <w:jc w:val="left"/>
-        <w:rPr>
-          <w:rFonts w:ascii="Times New Roman" w:hAnsi="Times New Roman" w:cs="Times New Roman"/>
-          <w:sz w:val="24"/>
-          <w:szCs w:val="24"/>
-          <w:lang w:val="en-US"/>
-        </w:rPr>
-      </w:pPr>
-    </w:p>
-    <w:p>
-      <w:pPr>
-        <w:jc w:val="left"/>
-        <w:rPr>
-          <w:rFonts w:ascii="Times New Roman" w:hAnsi="Times New Roman" w:cs="Times New Roman"/>
-          <w:sz w:val="24"/>
-          <w:szCs w:val="24"/>
-          <w:lang w:val="en-US"/>
-        </w:rPr>
-      </w:pPr>
-    </w:p>
-    <w:p>
-      <w:pPr>
-        <w:jc w:val="left"/>
-        <w:rPr>
-          <w:rFonts w:ascii="Times New Roman" w:hAnsi="Times New Roman" w:cs="Times New Roman"/>
-          <w:sz w:val="24"/>
-          <w:szCs w:val="24"/>
-          <w:lang w:val="en-US"/>
-        </w:rPr>
-      </w:pPr>
-    </w:p>
-    <w:p>
-      <w:pPr>
-        <w:jc w:val="left"/>
-        <w:rPr>
-          <w:rFonts w:ascii="Times New Roman" w:hAnsi="Times New Roman" w:cs="Times New Roman"/>
-          <w:sz w:val="24"/>
-          <w:szCs w:val="24"/>
-          <w:lang w:val="en-US"/>
-        </w:rPr>
-      </w:pPr>
-    </w:p>
-    <w:p>
-      <w:pPr>
-        <w:jc w:val="left"/>
-        <w:rPr>
-          <w:rFonts w:ascii="Times New Roman" w:hAnsi="Times New Roman" w:cs="Times New Roman"/>
-          <w:sz w:val="24"/>
-          <w:szCs w:val="24"/>
-          <w:lang w:val="en-US"/>
-        </w:rPr>
-      </w:pPr>
-    </w:p>
-    <w:p>
-      <w:pPr>
-        <w:jc w:val="left"/>
-        <w:rPr>
-          <w:rFonts w:ascii="Times New Roman" w:hAnsi="Times New Roman" w:cs="Times New Roman"/>
-          <w:sz w:val="24"/>
-          <w:szCs w:val="24"/>
-          <w:lang w:val="en-US"/>
-        </w:rPr>
-      </w:pPr>
-    </w:p>
-    <w:p>
-      <w:pPr>
-        <w:jc w:val="left"/>
-        <w:rPr>
-          <w:rFonts w:ascii="Times New Roman" w:hAnsi="Times New Roman" w:cs="Times New Roman"/>
-          <w:sz w:val="24"/>
-          <w:szCs w:val="24"/>
-          <w:lang w:val="en-US"/>
-        </w:rPr>
-      </w:pPr>
-    </w:p>
-    <w:p>
-      <w:pPr>
-        <w:jc w:val="left"/>
-        <w:rPr>
-          <w:rFonts w:ascii="Times New Roman" w:hAnsi="Times New Roman" w:cs="Times New Roman"/>
-          <w:sz w:val="24"/>
-          <w:szCs w:val="24"/>
-          <w:lang w:val="en-US"/>
-        </w:rPr>
-      </w:pPr>
-    </w:p>
-    <w:p>
-      <w:pPr>
-        <w:jc w:val="left"/>
-        <w:rPr>
-          <w:rFonts w:ascii="Times New Roman" w:hAnsi="Times New Roman" w:cs="Times New Roman"/>
-          <w:sz w:val="24"/>
-          <w:szCs w:val="24"/>
-          <w:lang w:val="en-US"/>
-        </w:rPr>
-      </w:pPr>
-    </w:p>
-    <w:p>
-      <w:pPr>
-        <w:jc w:val="left"/>
-        <w:rPr>
-          <w:rFonts w:ascii="Times New Roman" w:hAnsi="Times New Roman" w:cs="Times New Roman"/>
-          <w:sz w:val="24"/>
-          <w:szCs w:val="24"/>
-          <w:lang w:val="en-US"/>
-        </w:rPr>
-      </w:pPr>
+      <w:r>
+        <w:rPr>
+          <w:rFonts w:ascii="Times New Roman" w:hAnsi="Times New Roman" w:cs="Times New Roman"/>
+          <w:sz w:val="24"/>
+          <w:szCs w:val="24"/>
+          <w:lang w:val="en-US"/>
+        </w:rPr>
+        <w:t>Git add, commit and push:</w:t>
+      </w:r>
+      <w:r>
+        <w:rPr>
+          <w:rFonts w:ascii="Times New Roman" w:hAnsi="Times New Roman" w:cs="Times New Roman"/>
+          <w:sz w:val="24"/>
+          <w:szCs w:val="24"/>
+          <w:lang w:val="en-US"/>
+        </w:rPr>
+        <w:br/>
+      </w:r>
+    </w:p>
+    <w:p>
+      <w:pPr>
+        <w:jc w:val="left"/>
+        <w:rPr>
+          <w:rFonts w:ascii="Times New Roman" w:hAnsi="Times New Roman" w:cs="Times New Roman"/>
+          <w:sz w:val="24"/>
+          <w:szCs w:val="24"/>
+          <w:lang w:val="en-US"/>
+        </w:rPr>
+      </w:pPr>
+      <w:r>
+        <w:rPr>
+          <w:rFonts w:ascii="Times New Roman" w:hAnsi="Times New Roman" w:cs="Times New Roman"/>
+          <w:sz w:val="24"/>
+          <w:szCs w:val="24"/>
+          <w:lang w:val="en-US"/>
+        </w:rPr>
+        <w:t xml:space="preserve">D:\robot-navigation&gt;git </w:t>
+      </w:r>
+      <w:proofErr w:type="gramStart"/>
+      <w:r>
+        <w:rPr>
+          <w:rFonts w:ascii="Times New Roman" w:hAnsi="Times New Roman" w:cs="Times New Roman"/>
+          <w:sz w:val="24"/>
+          <w:szCs w:val="24"/>
+          <w:lang w:val="en-US"/>
+        </w:rPr>
+        <w:t>add .</w:t>
+      </w:r>
+      <w:proofErr w:type="gramEnd"/>
+      <w:r>
+        <w:rPr>
+          <w:rFonts w:ascii="Times New Roman" w:hAnsi="Times New Roman" w:cs="Times New Roman"/>
+          <w:sz w:val="24"/>
+          <w:szCs w:val="24"/>
+          <w:lang w:val="en-US"/>
+        </w:rPr>
+        <w:t xml:space="preserve">          </w:t>
+      </w:r>
+    </w:p>
+    <w:p>
+      <w:pPr>
+        <w:jc w:val="left"/>
+        <w:rPr>
+          <w:rFonts w:ascii="Times New Roman" w:hAnsi="Times New Roman" w:cs="Times New Roman"/>
+          <w:sz w:val="24"/>
+          <w:szCs w:val="24"/>
+          <w:lang w:val="en-US"/>
+        </w:rPr>
+      </w:pPr>
+    </w:p>
+    <w:p>
+      <w:pPr>
+        <w:jc w:val="left"/>
+        <w:rPr>
+          <w:rFonts w:ascii="Times New Roman" w:hAnsi="Times New Roman" w:cs="Times New Roman"/>
+          <w:sz w:val="24"/>
+          <w:szCs w:val="24"/>
+          <w:lang w:val="en-US"/>
+        </w:rPr>
+      </w:pPr>
+      <w:r>
+        <w:rPr>
+          <w:rFonts w:ascii="Times New Roman" w:hAnsi="Times New Roman" w:cs="Times New Roman"/>
+          <w:sz w:val="24"/>
+          <w:szCs w:val="24"/>
+          <w:lang w:val="en-US"/>
+        </w:rPr>
+        <w:t>D:\robot-navigation&gt;git commit -m "feat: completed the Problem: Grid-Based Robot Navigation with Obstacle Avoidance"</w:t>
+      </w:r>
+    </w:p>
+    <w:p>
+      <w:pPr>
+        <w:jc w:val="left"/>
+        <w:rPr>
+          <w:rFonts w:ascii="Times New Roman" w:hAnsi="Times New Roman" w:cs="Times New Roman"/>
+          <w:sz w:val="24"/>
+          <w:szCs w:val="24"/>
+          <w:lang w:val="en-US"/>
+        </w:rPr>
+      </w:pPr>
+      <w:r>
+        <w:rPr>
+          <w:rFonts w:ascii="Times New Roman" w:hAnsi="Times New Roman" w:cs="Times New Roman"/>
+          <w:sz w:val="24"/>
+          <w:szCs w:val="24"/>
+          <w:lang w:val="en-US"/>
+        </w:rPr>
+        <w:t>[main (root-commit) 2d64f3e] feat: completed the Problem: Grid-Based Robot Navigation with Obstacle Avoidance</w:t>
+      </w:r>
+    </w:p>
+    <w:p>
+      <w:pPr>
+        <w:jc w:val="left"/>
+        <w:rPr>
+          <w:rFonts w:ascii="Times New Roman" w:hAnsi="Times New Roman" w:cs="Times New Roman"/>
+          <w:sz w:val="24"/>
+          <w:szCs w:val="24"/>
+          <w:lang w:val="en-US"/>
+        </w:rPr>
+      </w:pPr>
+      <w:r>
+        <w:rPr>
+          <w:rFonts w:ascii="Times New Roman" w:hAnsi="Times New Roman" w:cs="Times New Roman"/>
+          <w:sz w:val="24"/>
+          <w:szCs w:val="24"/>
+          <w:lang w:val="en-US"/>
+        </w:rPr>
+        <w:t xml:space="preserve"> 14 files changed, 3886 </w:t>
+      </w:r>
+      <w:proofErr w:type="gramStart"/>
+      <w:r>
+        <w:rPr>
+          <w:rFonts w:ascii="Times New Roman" w:hAnsi="Times New Roman" w:cs="Times New Roman"/>
+          <w:sz w:val="24"/>
+          <w:szCs w:val="24"/>
+          <w:lang w:val="en-US"/>
+        </w:rPr>
+        <w:t>insertions(</w:t>
+      </w:r>
+      <w:proofErr w:type="gramEnd"/>
+      <w:r>
+        <w:rPr>
+          <w:rFonts w:ascii="Times New Roman" w:hAnsi="Times New Roman" w:cs="Times New Roman"/>
+          <w:sz w:val="24"/>
+          <w:szCs w:val="24"/>
+          <w:lang w:val="en-US"/>
+        </w:rPr>
+        <w:t>+)</w:t>
+      </w:r>
+    </w:p>
+    <w:p>
+      <w:pPr>
+        <w:jc w:val="left"/>
+        <w:rPr>
+          <w:rFonts w:ascii="Times New Roman" w:hAnsi="Times New Roman" w:cs="Times New Roman"/>
+          <w:sz w:val="24"/>
+          <w:szCs w:val="24"/>
+          <w:lang w:val="en-US"/>
+        </w:rPr>
+      </w:pPr>
+      <w:r>
+        <w:rPr>
+          <w:rFonts w:ascii="Times New Roman" w:hAnsi="Times New Roman" w:cs="Times New Roman"/>
+          <w:sz w:val="24"/>
+          <w:szCs w:val="24"/>
+          <w:lang w:val="en-US"/>
+        </w:rPr>
+        <w:t xml:space="preserve"> create mode 100644 00_START_HERE.txt</w:t>
+      </w:r>
+    </w:p>
+    <w:p>
+      <w:pPr>
+        <w:jc w:val="left"/>
+        <w:rPr>
+          <w:rFonts w:ascii="Times New Roman" w:hAnsi="Times New Roman" w:cs="Times New Roman"/>
+          <w:sz w:val="24"/>
+          <w:szCs w:val="24"/>
+          <w:lang w:val="en-US"/>
+        </w:rPr>
+      </w:pPr>
+      <w:r>
+        <w:rPr>
+          <w:rFonts w:ascii="Times New Roman" w:hAnsi="Times New Roman" w:cs="Times New Roman"/>
+          <w:sz w:val="24"/>
+          <w:szCs w:val="24"/>
+          <w:lang w:val="en-US"/>
+        </w:rPr>
+        <w:t xml:space="preserve"> create mode 100644 ARCHITECTURE.md</w:t>
+      </w:r>
+    </w:p>
+    <w:p>
+      <w:pPr>
+        <w:jc w:val="left"/>
+        <w:rPr>
+          <w:rFonts w:ascii="Times New Roman" w:hAnsi="Times New Roman" w:cs="Times New Roman"/>
+          <w:sz w:val="24"/>
+          <w:szCs w:val="24"/>
+          <w:lang w:val="en-US"/>
+        </w:rPr>
+      </w:pPr>
+      <w:r>
+        <w:rPr>
+          <w:rFonts w:ascii="Times New Roman" w:hAnsi="Times New Roman" w:cs="Times New Roman"/>
+          <w:sz w:val="24"/>
+          <w:szCs w:val="24"/>
+          <w:lang w:val="en-US"/>
+        </w:rPr>
+        <w:lastRenderedPageBreak/>
+        <w:t xml:space="preserve"> create mode 100644 COMPLETION_REPORT.txt</w:t>
+      </w:r>
+    </w:p>
+    <w:p>
+      <w:pPr>
+        <w:jc w:val="left"/>
+        <w:rPr>
+          <w:rFonts w:ascii="Times New Roman" w:hAnsi="Times New Roman" w:cs="Times New Roman"/>
+          <w:sz w:val="24"/>
+          <w:szCs w:val="24"/>
+          <w:lang w:val="en-US"/>
+        </w:rPr>
+      </w:pPr>
+      <w:r>
+        <w:rPr>
+          <w:rFonts w:ascii="Times New Roman" w:hAnsi="Times New Roman" w:cs="Times New Roman"/>
+          <w:sz w:val="24"/>
+          <w:szCs w:val="24"/>
+          <w:lang w:val="en-US"/>
+        </w:rPr>
+        <w:t xml:space="preserve"> create mode 100644 DELIVERY_SUMMARY.md</w:t>
+      </w:r>
+    </w:p>
+    <w:p>
+      <w:pPr>
+        <w:jc w:val="left"/>
+        <w:rPr>
+          <w:rFonts w:ascii="Times New Roman" w:hAnsi="Times New Roman" w:cs="Times New Roman"/>
+          <w:sz w:val="24"/>
+          <w:szCs w:val="24"/>
+          <w:lang w:val="en-US"/>
+        </w:rPr>
+      </w:pPr>
+      <w:r>
+        <w:rPr>
+          <w:rFonts w:ascii="Times New Roman" w:hAnsi="Times New Roman" w:cs="Times New Roman"/>
+          <w:sz w:val="24"/>
+          <w:szCs w:val="24"/>
+          <w:lang w:val="en-US"/>
+        </w:rPr>
+        <w:t xml:space="preserve"> create mode 100644 FINAL_SUMMARY.txt</w:t>
+      </w:r>
+    </w:p>
+    <w:p>
+      <w:pPr>
+        <w:jc w:val="left"/>
+        <w:rPr>
+          <w:rFonts w:ascii="Times New Roman" w:hAnsi="Times New Roman" w:cs="Times New Roman"/>
+          <w:sz w:val="24"/>
+          <w:szCs w:val="24"/>
+          <w:lang w:val="en-US"/>
+        </w:rPr>
+      </w:pPr>
+      <w:r>
+        <w:rPr>
+          <w:rFonts w:ascii="Times New Roman" w:hAnsi="Times New Roman" w:cs="Times New Roman"/>
+          <w:sz w:val="24"/>
+          <w:szCs w:val="24"/>
+          <w:lang w:val="en-US"/>
+        </w:rPr>
+        <w:t xml:space="preserve"> create mode 100644 IMPLEMENTATION_CHECKLIST.md</w:t>
+      </w:r>
+    </w:p>
+    <w:p>
+      <w:pPr>
+        <w:jc w:val="left"/>
+        <w:rPr>
+          <w:rFonts w:ascii="Times New Roman" w:hAnsi="Times New Roman" w:cs="Times New Roman"/>
+          <w:sz w:val="24"/>
+          <w:szCs w:val="24"/>
+          <w:lang w:val="en-US"/>
+        </w:rPr>
+      </w:pPr>
+      <w:r>
+        <w:rPr>
+          <w:rFonts w:ascii="Times New Roman" w:hAnsi="Times New Roman" w:cs="Times New Roman"/>
+          <w:sz w:val="24"/>
+          <w:szCs w:val="24"/>
+          <w:lang w:val="en-US"/>
+        </w:rPr>
+        <w:t xml:space="preserve"> create mode 100644 INDEX.md</w:t>
+      </w:r>
+    </w:p>
+    <w:p>
+      <w:pPr>
+        <w:jc w:val="left"/>
+        <w:rPr>
+          <w:rFonts w:ascii="Times New Roman" w:hAnsi="Times New Roman" w:cs="Times New Roman"/>
+          <w:sz w:val="24"/>
+          <w:szCs w:val="24"/>
+          <w:lang w:val="en-US"/>
+        </w:rPr>
+      </w:pPr>
+      <w:r>
+        <w:rPr>
+          <w:rFonts w:ascii="Times New Roman" w:hAnsi="Times New Roman" w:cs="Times New Roman"/>
+          <w:sz w:val="24"/>
+          <w:szCs w:val="24"/>
+          <w:lang w:val="en-US"/>
+        </w:rPr>
+        <w:t xml:space="preserve"> create mode 100644 MANIFEST.txt</w:t>
+      </w:r>
+    </w:p>
+    <w:p>
+      <w:pPr>
+        <w:jc w:val="left"/>
+        <w:rPr>
+          <w:rFonts w:ascii="Times New Roman" w:hAnsi="Times New Roman" w:cs="Times New Roman"/>
+          <w:sz w:val="24"/>
+          <w:szCs w:val="24"/>
+          <w:lang w:val="en-US"/>
+        </w:rPr>
+      </w:pPr>
+      <w:r>
+        <w:rPr>
+          <w:rFonts w:ascii="Times New Roman" w:hAnsi="Times New Roman" w:cs="Times New Roman"/>
+          <w:sz w:val="24"/>
+          <w:szCs w:val="24"/>
+          <w:lang w:val="en-US"/>
+        </w:rPr>
+        <w:t xml:space="preserve"> create mode 100644 QUICKSTART.md</w:t>
+      </w:r>
+    </w:p>
+    <w:p>
+      <w:pPr>
+        <w:jc w:val="left"/>
+        <w:rPr>
+          <w:rFonts w:ascii="Times New Roman" w:hAnsi="Times New Roman" w:cs="Times New Roman"/>
+          <w:sz w:val="24"/>
+          <w:szCs w:val="24"/>
+          <w:lang w:val="en-US"/>
+        </w:rPr>
+      </w:pPr>
+      <w:r>
+        <w:rPr>
+          <w:rFonts w:ascii="Times New Roman" w:hAnsi="Times New Roman" w:cs="Times New Roman"/>
+          <w:sz w:val="24"/>
+          <w:szCs w:val="24"/>
+          <w:lang w:val="en-US"/>
+        </w:rPr>
+        <w:t xml:space="preserve"> create mode 100644 README.md</w:t>
+      </w:r>
+    </w:p>
+    <w:p>
+      <w:pPr>
+        <w:jc w:val="left"/>
+        <w:rPr>
+          <w:rFonts w:ascii="Times New Roman" w:hAnsi="Times New Roman" w:cs="Times New Roman"/>
+          <w:sz w:val="24"/>
+          <w:szCs w:val="24"/>
+          <w:lang w:val="en-US"/>
+        </w:rPr>
+      </w:pPr>
+      <w:r>
+        <w:rPr>
+          <w:rFonts w:ascii="Times New Roman" w:hAnsi="Times New Roman" w:cs="Times New Roman"/>
+          <w:sz w:val="24"/>
+          <w:szCs w:val="24"/>
+          <w:lang w:val="en-US"/>
+        </w:rPr>
+        <w:t xml:space="preserve"> create mode 100644 Robot Navigation with Obstacle Avoidance.docx</w:t>
+      </w:r>
+    </w:p>
+    <w:p>
+      <w:pPr>
+        <w:jc w:val="left"/>
+        <w:rPr>
+          <w:rFonts w:ascii="Times New Roman" w:hAnsi="Times New Roman" w:cs="Times New Roman"/>
+          <w:sz w:val="24"/>
+          <w:szCs w:val="24"/>
+          <w:lang w:val="en-US"/>
+        </w:rPr>
+      </w:pPr>
+      <w:r>
+        <w:rPr>
+          <w:rFonts w:ascii="Times New Roman" w:hAnsi="Times New Roman" w:cs="Times New Roman"/>
+          <w:sz w:val="24"/>
+          <w:szCs w:val="24"/>
+          <w:lang w:val="en-US"/>
+        </w:rPr>
+        <w:t xml:space="preserve"> create mode 100644 all codes pasted.txt</w:t>
+      </w:r>
+    </w:p>
+    <w:p>
+      <w:pPr>
+        <w:jc w:val="left"/>
+        <w:rPr>
+          <w:rFonts w:ascii="Times New Roman" w:hAnsi="Times New Roman" w:cs="Times New Roman"/>
+          <w:sz w:val="24"/>
+          <w:szCs w:val="24"/>
+          <w:lang w:val="en-US"/>
+        </w:rPr>
+      </w:pPr>
+      <w:r>
+        <w:rPr>
+          <w:rFonts w:ascii="Times New Roman" w:hAnsi="Times New Roman" w:cs="Times New Roman"/>
+          <w:sz w:val="24"/>
+          <w:szCs w:val="24"/>
+          <w:lang w:val="en-US"/>
+        </w:rPr>
+        <w:t xml:space="preserve"> create mode 100644 navigator.py</w:t>
+      </w:r>
+    </w:p>
+    <w:p>
+      <w:pPr>
+        <w:jc w:val="left"/>
+        <w:rPr>
+          <w:rFonts w:ascii="Times New Roman" w:hAnsi="Times New Roman" w:cs="Times New Roman"/>
+          <w:sz w:val="24"/>
+          <w:szCs w:val="24"/>
+          <w:lang w:val="en-US"/>
+        </w:rPr>
+      </w:pPr>
+      <w:r>
+        <w:rPr>
+          <w:rFonts w:ascii="Times New Roman" w:hAnsi="Times New Roman" w:cs="Times New Roman"/>
+          <w:sz w:val="24"/>
+          <w:szCs w:val="24"/>
+          <w:lang w:val="en-US"/>
+        </w:rPr>
+        <w:t xml:space="preserve"> create mode 100644 ~$bot Navigation with Obstacle Avoidance.docx</w:t>
+      </w:r>
+    </w:p>
+    <w:p>
+      <w:pPr>
+        <w:jc w:val="left"/>
+        <w:rPr>
+          <w:rFonts w:ascii="Times New Roman" w:hAnsi="Times New Roman" w:cs="Times New Roman"/>
+          <w:sz w:val="24"/>
+          <w:szCs w:val="24"/>
+          <w:lang w:val="en-US"/>
+        </w:rPr>
+      </w:pPr>
+    </w:p>
+    <w:p>
+      <w:pPr>
+        <w:jc w:val="left"/>
+        <w:rPr>
+          <w:rFonts w:ascii="Times New Roman" w:hAnsi="Times New Roman" w:cs="Times New Roman"/>
+          <w:sz w:val="24"/>
+          <w:szCs w:val="24"/>
+          <w:lang w:val="en-US"/>
+        </w:rPr>
+      </w:pPr>
+      <w:r>
+        <w:rPr>
+          <w:rFonts w:ascii="Times New Roman" w:hAnsi="Times New Roman" w:cs="Times New Roman"/>
+          <w:sz w:val="24"/>
+          <w:szCs w:val="24"/>
+          <w:lang w:val="en-US"/>
+        </w:rPr>
+        <w:t>D:\robot-navigation&gt;git push origin main</w:t>
+      </w:r>
+    </w:p>
+    <w:p>
+      <w:pPr>
+        <w:jc w:val="left"/>
+        <w:rPr>
+          <w:rFonts w:ascii="Times New Roman" w:hAnsi="Times New Roman" w:cs="Times New Roman"/>
+          <w:sz w:val="24"/>
+          <w:szCs w:val="24"/>
+          <w:lang w:val="en-US"/>
+        </w:rPr>
+      </w:pPr>
+      <w:r>
+        <w:rPr>
+          <w:rFonts w:ascii="Times New Roman" w:hAnsi="Times New Roman" w:cs="Times New Roman"/>
+          <w:sz w:val="24"/>
+          <w:szCs w:val="24"/>
+          <w:lang w:val="en-US"/>
+        </w:rPr>
+        <w:t>Enumerating objects: 16, done.</w:t>
+      </w:r>
+    </w:p>
+    <w:p>
+      <w:pPr>
+        <w:jc w:val="left"/>
+        <w:rPr>
+          <w:rFonts w:ascii="Times New Roman" w:hAnsi="Times New Roman" w:cs="Times New Roman"/>
+          <w:sz w:val="24"/>
+          <w:szCs w:val="24"/>
+          <w:lang w:val="en-US"/>
+        </w:rPr>
+      </w:pPr>
+      <w:r>
+        <w:rPr>
+          <w:rFonts w:ascii="Times New Roman" w:hAnsi="Times New Roman" w:cs="Times New Roman"/>
+          <w:sz w:val="24"/>
+          <w:szCs w:val="24"/>
+          <w:lang w:val="en-US"/>
+        </w:rPr>
+        <w:t>Counting objects: 100% (16/16), done.</w:t>
+      </w:r>
+    </w:p>
+    <w:p>
+      <w:pPr>
+        <w:jc w:val="left"/>
+        <w:rPr>
+          <w:rFonts w:ascii="Times New Roman" w:hAnsi="Times New Roman" w:cs="Times New Roman"/>
+          <w:sz w:val="24"/>
+          <w:szCs w:val="24"/>
+          <w:lang w:val="en-US"/>
+        </w:rPr>
+      </w:pPr>
+      <w:r>
+        <w:rPr>
+          <w:rFonts w:ascii="Times New Roman" w:hAnsi="Times New Roman" w:cs="Times New Roman"/>
+          <w:sz w:val="24"/>
+          <w:szCs w:val="24"/>
+          <w:lang w:val="en-US"/>
+        </w:rPr>
+        <w:t>Delta compression using up to 4 threads</w:t>
+      </w:r>
+    </w:p>
+    <w:p>
+      <w:pPr>
+        <w:jc w:val="left"/>
+        <w:rPr>
+          <w:rFonts w:ascii="Times New Roman" w:hAnsi="Times New Roman" w:cs="Times New Roman"/>
+          <w:sz w:val="24"/>
+          <w:szCs w:val="24"/>
+          <w:lang w:val="en-US"/>
+        </w:rPr>
+      </w:pPr>
+      <w:r>
+        <w:rPr>
+          <w:rFonts w:ascii="Times New Roman" w:hAnsi="Times New Roman" w:cs="Times New Roman"/>
+          <w:sz w:val="24"/>
+          <w:szCs w:val="24"/>
+          <w:lang w:val="en-US"/>
+        </w:rPr>
+        <w:t>Compressing objects: 100% (16/16), done.</w:t>
+      </w:r>
+    </w:p>
+    <w:p>
+      <w:pPr>
+        <w:jc w:val="left"/>
+        <w:rPr>
+          <w:rFonts w:ascii="Times New Roman" w:hAnsi="Times New Roman" w:cs="Times New Roman"/>
+          <w:sz w:val="24"/>
+          <w:szCs w:val="24"/>
+          <w:lang w:val="en-US"/>
+        </w:rPr>
+      </w:pPr>
+      <w:r>
+        <w:rPr>
+          <w:rFonts w:ascii="Times New Roman" w:hAnsi="Times New Roman" w:cs="Times New Roman"/>
+          <w:sz w:val="24"/>
+          <w:szCs w:val="24"/>
+          <w:lang w:val="en-US"/>
+        </w:rPr>
+        <w:t>Writing objects: 100% (16/16), 481.64 KiB | 9.44 MiB/s, done.</w:t>
+      </w:r>
+    </w:p>
+    <w:p>
+      <w:pPr>
+        <w:jc w:val="left"/>
+        <w:rPr>
+          <w:rFonts w:ascii="Times New Roman" w:hAnsi="Times New Roman" w:cs="Times New Roman"/>
+          <w:sz w:val="24"/>
+          <w:szCs w:val="24"/>
+          <w:lang w:val="en-US"/>
+        </w:rPr>
+      </w:pPr>
+      <w:r>
+        <w:rPr>
+          <w:rFonts w:ascii="Times New Roman" w:hAnsi="Times New Roman" w:cs="Times New Roman"/>
+          <w:sz w:val="24"/>
+          <w:szCs w:val="24"/>
+          <w:lang w:val="en-US"/>
+        </w:rPr>
+        <w:t>Total 16 (delta 0), reused 0 (delta 0), pack-reused 0 (from 0)</w:t>
+      </w:r>
+    </w:p>
+    <w:p>
+      <w:pPr>
+        <w:jc w:val="left"/>
+        <w:rPr>
+          <w:rFonts w:ascii="Times New Roman" w:hAnsi="Times New Roman" w:cs="Times New Roman"/>
+          <w:sz w:val="24"/>
+          <w:szCs w:val="24"/>
+          <w:lang w:val="en-US"/>
+        </w:rPr>
+      </w:pPr>
+      <w:r>
+        <w:rPr>
+          <w:rFonts w:ascii="Times New Roman" w:hAnsi="Times New Roman" w:cs="Times New Roman"/>
+          <w:sz w:val="24"/>
+          <w:szCs w:val="24"/>
+          <w:lang w:val="en-US"/>
+        </w:rPr>
+        <w:t>To https://github.com/pritiudata0810-commits/robot-navigation.git</w:t>
+      </w:r>
+    </w:p>
+    <w:p>
+      <w:pPr>
+        <w:jc w:val="left"/>
+        <w:rPr>
+          <w:rFonts w:ascii="Times New Roman" w:hAnsi="Times New Roman" w:cs="Times New Roman"/>
+          <w:sz w:val="24"/>
+          <w:szCs w:val="24"/>
+          <w:lang w:val="en-US"/>
+        </w:rPr>
+      </w:pPr>
+      <w:r>
+        <w:rPr>
+          <w:noProof/>
+        </w:rPr>
+        <w:drawing>
+          <wp:anchor distT="0" distB="0" distL="114300" distR="114300" simplePos="0" relativeHeight="251662336" behindDoc="0" locked="0" layoutInCell="1" allowOverlap="1" wp14:anchorId="35C3F2E3" wp14:editId="1A607AD2">
+            <wp:simplePos x="0" y="0"/>
+            <wp:positionH relativeFrom="margin">
+              <wp:align>right</wp:align>
+            </wp:positionH>
+            <wp:positionV relativeFrom="page">
+              <wp:posOffset>6867746</wp:posOffset>
+            </wp:positionV>
+            <wp:extent cx="6645910" cy="3253105"/>
+            <wp:effectExtent l="0" t="0" r="2540" b="4445"/>
+            <wp:wrapSquare wrapText="bothSides"/>
+            <wp:docPr id="878823794" name="Picture 1"/>
+            <wp:cNvGraphicFramePr>
+              <a:graphicFrameLocks xmlns:a="http://schemas.openxmlformats.org/drawingml/2006/main" noChangeAspect="1"/>
+            </wp:cNvGraphicFramePr>
+            <a:graphic xmlns:a="http://schemas.openxmlformats.org/drawingml/2006/main">
+              <a:graphicData uri="http://schemas.openxmlformats.org/drawingml/2006/picture">
+                <pic:pic xmlns:pic="http://schemas.openxmlformats.org/drawingml/2006/picture">
+                  <pic:nvPicPr>
+                    <pic:cNvPr id="878823794" name=""/>
+                    <pic:cNvPicPr/>
+                  </pic:nvPicPr>
+                  <pic:blipFill>
+                    <a:blip r:embed="rId10" cstate="print">
+                      <a:extLst>
+                        <a:ext uri="{28A0092B-C50C-407E-A947-70E740481C1C}">
+                          <a14:useLocalDpi xmlns:a14="http://schemas.microsoft.com/office/drawing/2010/main" val="0"/>
+                        </a:ext>
+                      </a:extLst>
+                    </a:blip>
+                    <a:stretch>
+                      <a:fillRect/>
+                    </a:stretch>
+                  </pic:blipFill>
+                  <pic:spPr>
+                    <a:xfrm>
+                      <a:off x="0" y="0"/>
+                      <a:ext cx="6649853" cy="3255492"/>
+                    </a:xfrm>
+                    <a:prstGeom prst="rect">
+                      <a:avLst/>
+                    </a:prstGeom>
+                  </pic:spPr>
+                </pic:pic>
+              </a:graphicData>
+            </a:graphic>
+            <wp14:sizeRelH relativeFrom="page">
+              <wp14:pctWidth>0</wp14:pctWidth>
+            </wp14:sizeRelH>
+            <wp14:sizeRelV relativeFrom="page">
+              <wp14:pctHeight>0</wp14:pctHeight>
+            </wp14:sizeRelV>
+          </wp:anchor>
+        </w:drawing>
+      </w:r>
+      <w:r>
+        <w:rPr>
+          <w:rFonts w:ascii="Times New Roman" w:hAnsi="Times New Roman" w:cs="Times New Roman"/>
+          <w:sz w:val="24"/>
+          <w:szCs w:val="24"/>
+          <w:lang w:val="en-US"/>
+        </w:rPr>
+        <w:t xml:space="preserve"> * [new </w:t>
+      </w:r>
+      <w:proofErr w:type="gramStart"/>
+      <w:r>
+        <w:rPr>
+          <w:rFonts w:ascii="Times New Roman" w:hAnsi="Times New Roman" w:cs="Times New Roman"/>
+          <w:sz w:val="24"/>
+          <w:szCs w:val="24"/>
+          <w:lang w:val="en-US"/>
+        </w:rPr>
+        <w:t xml:space="preserve">branch]   </w:t>
+      </w:r>
+      <w:proofErr w:type="gramEnd"/>
+      <w:r>
+        <w:rPr>
+          <w:rFonts w:ascii="Times New Roman" w:hAnsi="Times New Roman" w:cs="Times New Roman"/>
+          <w:sz w:val="24"/>
+          <w:szCs w:val="24"/>
+          <w:lang w:val="en-US"/>
+        </w:rPr>
+        <w:t xml:space="preserve">   main -&gt; main</w:t>
+      </w:r>
+    </w:p>
+    <w:p>
+      <w:pPr>
+        <w:jc w:val="left"/>
+        <w:rPr>
+          <w:rFonts w:ascii="Times New Roman" w:hAnsi="Times New Roman" w:cs="Times New Roman"/>
+          <w:b/>
+          <w:bCs/>
+          <w:sz w:val="32"/>
+          <w:szCs w:val="32"/>
+          <w:lang w:val="en-US"/>
+        </w:rPr>
+      </w:pPr>
+      <w:r>
+        <w:rPr>
+          <w:noProof/>
+        </w:rPr>
+        <w:lastRenderedPageBreak/>
+        <w:drawing>
+          <wp:anchor distT="0" distB="0" distL="114300" distR="114300" simplePos="0" relativeHeight="251663360" behindDoc="0" locked="0" layoutInCell="1" allowOverlap="1" wp14:anchorId="0A6A3AD8" wp14:editId="2231548D">
+            <wp:simplePos x="0" y="0"/>
+            <wp:positionH relativeFrom="column">
+              <wp:posOffset>-41910</wp:posOffset>
+            </wp:positionH>
+            <wp:positionV relativeFrom="page">
+              <wp:posOffset>849748</wp:posOffset>
+            </wp:positionV>
+            <wp:extent cx="6645910" cy="3738245"/>
+            <wp:effectExtent l="0" t="0" r="2540" b="0"/>
+            <wp:wrapSquare wrapText="bothSides"/>
+            <wp:docPr id="956472484" name="Picture 1"/>
+            <wp:cNvGraphicFramePr>
+              <a:graphicFrameLocks xmlns:a="http://schemas.openxmlformats.org/drawingml/2006/main" noChangeAspect="1"/>
+            </wp:cNvGraphicFramePr>
+            <a:graphic xmlns:a="http://schemas.openxmlformats.org/drawingml/2006/main">
+              <a:graphicData uri="http://schemas.openxmlformats.org/drawingml/2006/picture">
+                <pic:pic xmlns:pic="http://schemas.openxmlformats.org/drawingml/2006/picture">
+                  <pic:nvPicPr>
+                    <pic:cNvPr id="956472484" name=""/>
+                    <pic:cNvPicPr/>
+                  </pic:nvPicPr>
+                  <pic:blipFill>
+                    <a:blip r:embed="rId11" cstate="print">
+                      <a:extLst>
+                        <a:ext uri="{28A0092B-C50C-407E-A947-70E740481C1C}">
+                          <a14:useLocalDpi xmlns:a14="http://schemas.microsoft.com/office/drawing/2010/main" val="0"/>
+                        </a:ext>
+                      </a:extLst>
+                    </a:blip>
+                    <a:stretch>
+                      <a:fillRect/>
+                    </a:stretch>
+                  </pic:blipFill>
+                  <pic:spPr>
+                    <a:xfrm>
+                      <a:off x="0" y="0"/>
+                      <a:ext cx="6645910" cy="3738245"/>
+                    </a:xfrm>
+                    <a:prstGeom prst="rect">
+                      <a:avLst/>
+                    </a:prstGeom>
+                  </pic:spPr>
+                </pic:pic>
+              </a:graphicData>
+            </a:graphic>
+            <wp14:sizeRelH relativeFrom="page">
+              <wp14:pctWidth>0</wp14:pctWidth>
+            </wp14:sizeRelH>
+            <wp14:sizeRelV relativeFrom="page">
+              <wp14:pctHeight>0</wp14:pctHeight>
+            </wp14:sizeRelV>
+          </wp:anchor>
+        </w:drawing>
+      </w:r>
+      <w:r>
+        <w:rPr>
+          <w:rFonts w:ascii="Times New Roman" w:hAnsi="Times New Roman" w:cs="Times New Roman"/>
+          <w:b/>
+          <w:bCs/>
+          <w:sz w:val="32"/>
+          <w:szCs w:val="32"/>
+          <w:lang w:val="en-US"/>
+        </w:rPr>
+        <w:t xml:space="preserve">After running the </w:t>
+      </w:r>
+      <w:r>
+        <w:rPr>
+          <w:rFonts w:ascii="Times New Roman" w:hAnsi="Times New Roman" w:cs="Times New Roman"/>
+          <w:b/>
+          <w:bCs/>
+          <w:color w:val="0070C0"/>
+          <w:sz w:val="32"/>
+          <w:szCs w:val="32"/>
+          <w:lang w:val="en-US"/>
+        </w:rPr>
+        <w:t xml:space="preserve">navigator.py </w:t>
+      </w:r>
+      <w:r>
+        <w:rPr>
+          <w:rFonts w:ascii="Times New Roman" w:hAnsi="Times New Roman" w:cs="Times New Roman"/>
+          <w:b/>
+          <w:bCs/>
+          <w:sz w:val="32"/>
+          <w:szCs w:val="32"/>
+          <w:lang w:val="en-US"/>
+        </w:rPr>
+        <w:t>code:</w:t>
+      </w:r>
+    </w:p>
+    <w:p>
+      <w:pPr>
+        <w:jc w:val="left"/>
+        <w:rPr>
+          <w:rFonts w:ascii="Times New Roman" w:hAnsi="Times New Roman" w:cs="Times New Roman"/>
+          <w:sz w:val="24"/>
+          <w:szCs w:val="24"/>
+          <w:lang w:val="en-US"/>
+        </w:rPr>
+      </w:pPr>
+      <w:r>
+        <w:rPr>
+          <w:rFonts w:ascii="Times New Roman" w:hAnsi="Times New Roman" w:cs="Times New Roman"/>
+          <w:sz w:val="24"/>
+          <w:szCs w:val="24"/>
+          <w:lang w:val="en-US"/>
+        </w:rPr>
+        <w:drawing>
+          <wp:anchor distT="0" distB="0" distL="114300" distR="114300" simplePos="0" relativeHeight="251664384" behindDoc="0" locked="0" layoutInCell="1" allowOverlap="1" wp14:anchorId="6EFD574D" wp14:editId="2499251B">
+            <wp:simplePos x="0" y="0"/>
+            <wp:positionH relativeFrom="margin">
+              <wp:align>right</wp:align>
+            </wp:positionH>
+            <wp:positionV relativeFrom="page">
+              <wp:posOffset>4845168</wp:posOffset>
+            </wp:positionV>
+            <wp:extent cx="6645910" cy="2131695"/>
+            <wp:effectExtent l="0" t="0" r="2540" b="1905"/>
+            <wp:wrapSquare wrapText="bothSides"/>
+            <wp:docPr id="139150124" name="Picture 1"/>
+            <wp:cNvGraphicFramePr>
+              <a:graphicFrameLocks xmlns:a="http://schemas.openxmlformats.org/drawingml/2006/main" noChangeAspect="1"/>
+            </wp:cNvGraphicFramePr>
+            <a:graphic xmlns:a="http://schemas.openxmlformats.org/drawingml/2006/main">
+              <a:graphicData uri="http://schemas.openxmlformats.org/drawingml/2006/picture">
+                <pic:pic xmlns:pic="http://schemas.openxmlformats.org/drawingml/2006/picture">
+                  <pic:nvPicPr>
+                    <pic:cNvPr id="139150124" name=""/>
+                    <pic:cNvPicPr/>
+                  </pic:nvPicPr>
+                  <pic:blipFill>
+                    <a:blip r:embed="rId12" cstate="print">
+                      <a:extLst>
+                        <a:ext uri="{28A0092B-C50C-407E-A947-70E740481C1C}">
+                          <a14:useLocalDpi xmlns:a14="http://schemas.microsoft.com/office/drawing/2010/main" val="0"/>
+                        </a:ext>
+                      </a:extLst>
+                    </a:blip>
+                    <a:stretch>
+                      <a:fillRect/>
+                    </a:stretch>
+                  </pic:blipFill>
+                  <pic:spPr>
+                    <a:xfrm>
+                      <a:off x="0" y="0"/>
+                      <a:ext cx="6645910" cy="2131695"/>
+                    </a:xfrm>
+                    <a:prstGeom prst="rect">
+                      <a:avLst/>
+                    </a:prstGeom>
+                  </pic:spPr>
+                </pic:pic>
+              </a:graphicData>
+            </a:graphic>
+            <wp14:sizeRelH relativeFrom="page">
+              <wp14:pctWidth>0</wp14:pctWidth>
+            </wp14:sizeRelH>
+            <wp14:sizeRelV relativeFrom="page">
+              <wp14:pctHeight>0</wp14:pctHeight>
+            </wp14:sizeRelV>
+          </wp:anchor>
+        </w:drawing>
+      </w:r>
+    </w:p>
+    <w:p>
+      <w:pPr>
+        <w:jc w:val="left"/>
+        <w:rPr>
+          <w:rFonts w:ascii="Times New Roman" w:hAnsi="Times New Roman" w:cs="Times New Roman"/>
+          <w:sz w:val="24"/>
+          <w:szCs w:val="24"/>
+          <w:lang w:val="en-US"/>
+        </w:rPr>
+      </w:pPr>
+      <w:r>
+        <w:rPr>
+          <w:rFonts w:ascii="Times New Roman" w:hAnsi="Times New Roman" w:cs="Times New Roman"/>
+          <w:sz w:val="24"/>
+          <w:szCs w:val="24"/>
+          <w:lang w:val="en-US"/>
+        </w:rPr>
+        <w:drawing>
+          <wp:anchor distT="0" distB="0" distL="114300" distR="114300" simplePos="0" relativeHeight="251665408" behindDoc="0" locked="0" layoutInCell="1" allowOverlap="1" wp14:anchorId="3EA536C3" wp14:editId="30BCBBE8">
+            <wp:simplePos x="0" y="0"/>
+            <wp:positionH relativeFrom="margin">
+              <wp:align>right</wp:align>
+            </wp:positionH>
+            <wp:positionV relativeFrom="page">
+              <wp:posOffset>7226462</wp:posOffset>
+            </wp:positionV>
+            <wp:extent cx="6645910" cy="2923540"/>
+            <wp:effectExtent l="0" t="0" r="2540" b="0"/>
+            <wp:wrapSquare wrapText="bothSides"/>
+            <wp:docPr id="1056040092" name="Picture 1"/>
+            <wp:cNvGraphicFramePr>
+              <a:graphicFrameLocks xmlns:a="http://schemas.openxmlformats.org/drawingml/2006/main" noChangeAspect="1"/>
+            </wp:cNvGraphicFramePr>
+            <a:graphic xmlns:a="http://schemas.openxmlformats.org/drawingml/2006/main">
+              <a:graphicData uri="http://schemas.openxmlformats.org/drawingml/2006/picture">
+                <pic:pic xmlns:pic="http://schemas.openxmlformats.org/drawingml/2006/picture">
+                  <pic:nvPicPr>
+                    <pic:cNvPr id="1056040092" name=""/>
+                    <pic:cNvPicPr/>
+                  </pic:nvPicPr>
+                  <pic:blipFill>
+                    <a:blip r:embed="rId13">
+                      <a:extLst>
+                        <a:ext uri="{28A0092B-C50C-407E-A947-70E740481C1C}">
+                          <a14:useLocalDpi xmlns:a14="http://schemas.microsoft.com/office/drawing/2010/main" val="0"/>
+                        </a:ext>
+                      </a:extLst>
+                    </a:blip>
+                    <a:stretch>
+                      <a:fillRect/>
+                    </a:stretch>
+                  </pic:blipFill>
+                  <pic:spPr>
+                    <a:xfrm>
+                      <a:off x="0" y="0"/>
+                      <a:ext cx="6648729" cy="2925193"/>
+                    </a:xfrm>
+                    <a:prstGeom prst="rect">
+                      <a:avLst/>
+                    </a:prstGeom>
+                  </pic:spPr>
+                </pic:pic>
+              </a:graphicData>
+            </a:graphic>
+            <wp14:sizeRelH relativeFrom="page">
+              <wp14:pctWidth>0</wp14:pctWidth>
+            </wp14:sizeRelH>
+            <wp14:sizeRelV relativeFrom="page">
+              <wp14:pctHeight>0</wp14:pctHeight>
+            </wp14:sizeRelV>
+          </wp:anchor>
+        </w:drawing>
+      </w:r>
+    </w:p>
+    <w:p>
+      <w:pPr>
+        <w:jc w:val="left"/>
+        <w:rPr>
+          <w:rFonts w:ascii="Times New Roman" w:hAnsi="Times New Roman" w:cs="Times New Roman"/>
+          <w:sz w:val="24"/>
+          <w:szCs w:val="24"/>
+          <w:lang w:val="en-US"/>
+        </w:rPr>
+      </w:pPr>
+      <w:r>
+        <w:rPr>
+          <w:rFonts w:ascii="Times New Roman" w:hAnsi="Times New Roman" w:cs="Times New Roman"/>
+          <w:sz w:val="24"/>
+          <w:szCs w:val="24"/>
+          <w:lang w:val="en-US"/>
+        </w:rPr>
+        <w:lastRenderedPageBreak/>
+        <w:drawing>
+          <wp:anchor distT="0" distB="0" distL="114300" distR="114300" simplePos="0" relativeHeight="251666432" behindDoc="0" locked="0" layoutInCell="1" allowOverlap="1" wp14:anchorId="57D76126" wp14:editId="701D06C2">
+            <wp:simplePos x="0" y="0"/>
+            <wp:positionH relativeFrom="margin">
+              <wp:align>right</wp:align>
+            </wp:positionH>
+            <wp:positionV relativeFrom="page">
+              <wp:posOffset>495994</wp:posOffset>
+            </wp:positionV>
+            <wp:extent cx="6645910" cy="2944495"/>
+            <wp:effectExtent l="0" t="0" r="2540" b="8255"/>
+            <wp:wrapSquare wrapText="bothSides"/>
+            <wp:docPr id="884544042" name="Picture 1"/>
+            <wp:cNvGraphicFramePr>
+              <a:graphicFrameLocks xmlns:a="http://schemas.openxmlformats.org/drawingml/2006/main" noChangeAspect="1"/>
+            </wp:cNvGraphicFramePr>
+            <a:graphic xmlns:a="http://schemas.openxmlformats.org/drawingml/2006/main">
+              <a:graphicData uri="http://schemas.openxmlformats.org/drawingml/2006/picture">
+                <pic:pic xmlns:pic="http://schemas.openxmlformats.org/drawingml/2006/picture">
+                  <pic:nvPicPr>
+                    <pic:cNvPr id="884544042" name=""/>
+                    <pic:cNvPicPr/>
+                  </pic:nvPicPr>
+                  <pic:blipFill>
+                    <a:blip r:embed="rId14" cstate="print">
+                      <a:extLst>
+                        <a:ext uri="{28A0092B-C50C-407E-A947-70E740481C1C}">
+                          <a14:useLocalDpi xmlns:a14="http://schemas.microsoft.com/office/drawing/2010/main" val="0"/>
+                        </a:ext>
+                      </a:extLst>
+                    </a:blip>
+                    <a:stretch>
+                      <a:fillRect/>
+                    </a:stretch>
+                  </pic:blipFill>
+                  <pic:spPr>
+                    <a:xfrm>
+                      <a:off x="0" y="0"/>
+                      <a:ext cx="6645910" cy="2944495"/>
+                    </a:xfrm>
+                    <a:prstGeom prst="rect">
+                      <a:avLst/>
+                    </a:prstGeom>
+                  </pic:spPr>
+                </pic:pic>
+              </a:graphicData>
+            </a:graphic>
+            <wp14:sizeRelH relativeFrom="page">
+              <wp14:pctWidth>0</wp14:pctWidth>
+            </wp14:sizeRelH>
+            <wp14:sizeRelV relativeFrom="page">
+              <wp14:pctHeight>0</wp14:pctHeight>
+            </wp14:sizeRelV>
+          </wp:anchor>
+        </w:drawing>
+      </w:r>
+    </w:p>
+    <w:p>
+      <w:pPr>
+        <w:jc w:val="left"/>
+        <w:rPr>
+          <w:rFonts w:ascii="Times New Roman" w:hAnsi="Times New Roman" w:cs="Times New Roman"/>
+          <w:sz w:val="24"/>
+          <w:szCs w:val="24"/>
+          <w:lang w:val="en-US"/>
+        </w:rPr>
+      </w:pPr>
+      <w:r>
+        <w:rPr>
+          <w:rFonts w:ascii="Times New Roman" w:hAnsi="Times New Roman" w:cs="Times New Roman"/>
+          <w:sz w:val="24"/>
+          <w:szCs w:val="24"/>
+          <w:lang w:val="en-US"/>
+        </w:rPr>
+        <w:drawing>
+          <wp:anchor distT="0" distB="0" distL="114300" distR="114300" simplePos="0" relativeHeight="251667456" behindDoc="0" locked="0" layoutInCell="1" allowOverlap="1" wp14:anchorId="7C5C8149" wp14:editId="4B3FF814">
+            <wp:simplePos x="0" y="0"/>
+            <wp:positionH relativeFrom="margin">
+              <wp:align>right</wp:align>
+            </wp:positionH>
+            <wp:positionV relativeFrom="page">
+              <wp:posOffset>4109735</wp:posOffset>
+            </wp:positionV>
+            <wp:extent cx="6645910" cy="2866390"/>
+            <wp:effectExtent l="0" t="0" r="2540" b="0"/>
+            <wp:wrapSquare wrapText="bothSides"/>
+            <wp:docPr id="717296000" name="Picture 1"/>
+            <wp:cNvGraphicFramePr>
+              <a:graphicFrameLocks xmlns:a="http://schemas.openxmlformats.org/drawingml/2006/main" noChangeAspect="1"/>
+            </wp:cNvGraphicFramePr>
+            <a:graphic xmlns:a="http://schemas.openxmlformats.org/drawingml/2006/main">
+              <a:graphicData uri="http://schemas.openxmlformats.org/drawingml/2006/picture">
+                <pic:pic xmlns:pic="http://schemas.openxmlformats.org/drawingml/2006/picture">
+                  <pic:nvPicPr>
+                    <pic:cNvPr id="717296000" name=""/>
+                    <pic:cNvPicPr/>
+                  </pic:nvPicPr>
+                  <pic:blipFill>
+                    <a:blip r:embed="rId15" cstate="print">
+                      <a:extLst>
+                        <a:ext uri="{28A0092B-C50C-407E-A947-70E740481C1C}">
+                          <a14:useLocalDpi xmlns:a14="http://schemas.microsoft.com/office/drawing/2010/main" val="0"/>
+                        </a:ext>
+                      </a:extLst>
+                    </a:blip>
+                    <a:stretch>
+                      <a:fillRect/>
+                    </a:stretch>
+                  </pic:blipFill>
+                  <pic:spPr>
+                    <a:xfrm>
+                      <a:off x="0" y="0"/>
+                      <a:ext cx="6645910" cy="2866390"/>
+                    </a:xfrm>
+                    <a:prstGeom prst="rect">
+                      <a:avLst/>
+                    </a:prstGeom>
+                  </pic:spPr>
+                </pic:pic>
+              </a:graphicData>
+            </a:graphic>
+            <wp14:sizeRelH relativeFrom="page">
+              <wp14:pctWidth>0</wp14:pctWidth>
+            </wp14:sizeRelH>
+            <wp14:sizeRelV relativeFrom="page">
+              <wp14:pctHeight>0</wp14:pctHeight>
+            </wp14:sizeRelV>
+          </wp:anchor>
+        </w:drawing>
+      </w:r>
+      <w:r>
+        <w:rPr>
+          <w:rFonts w:ascii="Times New Roman" w:hAnsi="Times New Roman" w:cs="Times New Roman"/>
+          <w:sz w:val="24"/>
+          <w:szCs w:val="24"/>
+          <w:lang w:val="en-US"/>
+        </w:rPr>
+        <w:t>Continues until Robot reaches to the destination:</w:t>
+      </w:r>
+    </w:p>
+    <w:p>
+      <w:pPr>
+        <w:jc w:val="left"/>
+        <w:rPr>
+          <w:rFonts w:ascii="Times New Roman" w:hAnsi="Times New Roman" w:cs="Times New Roman"/>
+          <w:sz w:val="24"/>
+          <w:szCs w:val="24"/>
+          <w:lang w:val="en-US"/>
+        </w:rPr>
+      </w:pPr>
+    </w:p>
+    <w:p>
+      <w:pPr>
+        <w:jc w:val="left"/>
+        <w:rPr>
+          <w:rFonts w:ascii="Times New Roman" w:hAnsi="Times New Roman" w:cs="Times New Roman"/>
+          <w:sz w:val="24"/>
+          <w:szCs w:val="24"/>
+          <w:lang w:val="en-US"/>
+        </w:rPr>
+      </w:pPr>
+      <w:r>
+        <w:rPr>
+          <w:rFonts w:ascii="Times New Roman" w:hAnsi="Times New Roman" w:cs="Times New Roman"/>
+          <w:sz w:val="24"/>
+          <w:szCs w:val="24"/>
+          <w:lang w:val="en-US"/>
+        </w:rPr>
+        <w:drawing>
+          <wp:anchor distT="0" distB="0" distL="114300" distR="114300" simplePos="0" relativeHeight="251668480" behindDoc="0" locked="0" layoutInCell="1" allowOverlap="1" wp14:anchorId="4F9B80BB" wp14:editId="47D82CEA">
+            <wp:simplePos x="0" y="0"/>
+            <wp:positionH relativeFrom="margin">
+              <wp:align>right</wp:align>
+            </wp:positionH>
+            <wp:positionV relativeFrom="page">
+              <wp:posOffset>7677224</wp:posOffset>
+            </wp:positionV>
+            <wp:extent cx="6645910" cy="2466340"/>
+            <wp:effectExtent l="0" t="0" r="2540" b="0"/>
+            <wp:wrapSquare wrapText="bothSides"/>
+            <wp:docPr id="1924197137" name="Picture 1"/>
+            <wp:cNvGraphicFramePr>
+              <a:graphicFrameLocks xmlns:a="http://schemas.openxmlformats.org/drawingml/2006/main" noChangeAspect="1"/>
+            </wp:cNvGraphicFramePr>
+            <a:graphic xmlns:a="http://schemas.openxmlformats.org/drawingml/2006/main">
+              <a:graphicData uri="http://schemas.openxmlformats.org/drawingml/2006/picture">
+                <pic:pic xmlns:pic="http://schemas.openxmlformats.org/drawingml/2006/picture">
+                  <pic:nvPicPr>
+                    <pic:cNvPr id="1924197137" name=""/>
+                    <pic:cNvPicPr/>
+                  </pic:nvPicPr>
+                  <pic:blipFill>
+                    <a:blip r:embed="rId16">
+                      <a:extLst>
+                        <a:ext uri="{28A0092B-C50C-407E-A947-70E740481C1C}">
+                          <a14:useLocalDpi xmlns:a14="http://schemas.microsoft.com/office/drawing/2010/main" val="0"/>
+                        </a:ext>
+                      </a:extLst>
+                    </a:blip>
+                    <a:stretch>
+                      <a:fillRect/>
+                    </a:stretch>
+                  </pic:blipFill>
+                  <pic:spPr>
+                    <a:xfrm>
+                      <a:off x="0" y="0"/>
+                      <a:ext cx="6653584" cy="2469601"/>
+                    </a:xfrm>
+                    <a:prstGeom prst="rect">
+                      <a:avLst/>
+                    </a:prstGeom>
+                  </pic:spPr>
+                </pic:pic>
+              </a:graphicData>
+            </a:graphic>
+            <wp14:sizeRelH relativeFrom="page">
+              <wp14:pctWidth>0</wp14:pctWidth>
+            </wp14:sizeRelH>
+            <wp14:sizeRelV relativeFrom="page">
+              <wp14:pctHeight>0</wp14:pctHeight>
+            </wp14:sizeRelV>
+          </wp:anchor>
+        </w:drawing>
+      </w:r>
+      <w:r>
+        <w:rPr>
+          <w:rFonts w:ascii="Times New Roman" w:hAnsi="Times New Roman" w:cs="Times New Roman"/>
+          <w:sz w:val="24"/>
+          <w:szCs w:val="24"/>
+          <w:lang w:val="en-US"/>
+        </w:rPr>
+        <w:t>At final:</w:t>
+      </w:r>
+    </w:p>
+    <w:p>
+      <w:pPr>
+        <w:jc w:val="left"/>
+        <w:rPr>
+          <w:rFonts w:ascii="Times New Roman" w:hAnsi="Times New Roman" w:cs="Times New Roman"/>
+          <w:sz w:val="24"/>
+          <w:szCs w:val="24"/>
+          <w:lang w:val="en-US"/>
+        </w:rPr>
+      </w:pPr>
+      <w:r>
+        <w:rPr>
+          <w:noProof/>
+        </w:rPr>
+        <w:lastRenderedPageBreak/>
+        <w:drawing>
+          <wp:anchor distT="0" distB="0" distL="114300" distR="114300" simplePos="0" relativeHeight="251669504" behindDoc="0" locked="0" layoutInCell="1" allowOverlap="1" wp14:anchorId="584C7E48" wp14:editId="2C492DDB">
+            <wp:simplePos x="0" y="0"/>
+            <wp:positionH relativeFrom="margin">
+              <wp:align>right</wp:align>
+            </wp:positionH>
+            <wp:positionV relativeFrom="page">
+              <wp:posOffset>865505</wp:posOffset>
+            </wp:positionV>
+            <wp:extent cx="6645910" cy="3740150"/>
+            <wp:effectExtent l="0" t="0" r="2540" b="0"/>
+            <wp:wrapSquare wrapText="bothSides"/>
+            <wp:docPr id="437526871" name="Picture 1"/>
+            <wp:cNvGraphicFramePr>
+              <a:graphicFrameLocks xmlns:a="http://schemas.openxmlformats.org/drawingml/2006/main" noChangeAspect="1"/>
+            </wp:cNvGraphicFramePr>
+            <a:graphic xmlns:a="http://schemas.openxmlformats.org/drawingml/2006/main">
+              <a:graphicData uri="http://schemas.openxmlformats.org/drawingml/2006/picture">
+                <pic:pic xmlns:pic="http://schemas.openxmlformats.org/drawingml/2006/picture">
+                  <pic:nvPicPr>
+                    <pic:cNvPr id="0" name="Picture 1"/>
+                    <pic:cNvPicPr>
+                      <a:picLocks noChangeAspect="1" noChangeArrowheads="1"/>
+                    </pic:cNvPicPr>
+                  </pic:nvPicPr>
+                  <pic:blipFill>
+                    <a:blip r:embed="rId17" cstate="print">
+                      <a:extLst>
+                        <a:ext uri="{28A0092B-C50C-407E-A947-70E740481C1C}">
+                          <a14:useLocalDpi xmlns:a14="http://schemas.microsoft.com/office/drawing/2010/main" val="0"/>
+                        </a:ext>
+                      </a:extLst>
+                    </a:blip>
+                    <a:srcRect/>
+                    <a:stretch>
+                      <a:fillRect/>
+                    </a:stretch>
+                  </pic:blipFill>
+                  <pic:spPr bwMode="auto">
+                    <a:xfrm>
+                      <a:off x="0" y="0"/>
+                      <a:ext cx="6645910" cy="3740150"/>
+                    </a:xfrm>
+                    <a:prstGeom prst="rect">
+                      <a:avLst/>
+                    </a:prstGeom>
+                    <a:noFill/>
+                    <a:ln>
+                      <a:noFill/>
+                    </a:ln>
+                  </pic:spPr>
+                </pic:pic>
+              </a:graphicData>
+            </a:graphic>
+            <wp14:sizeRelH relativeFrom="page">
+              <wp14:pctWidth>0</wp14:pctWidth>
+            </wp14:sizeRelH>
+            <wp14:sizeRelV relativeFrom="page">
+              <wp14:pctHeight>0</wp14:pctHeight>
+            </wp14:sizeRelV>
+          </wp:anchor>
+        </w:drawing>
+      </w:r>
+      <w:r>
+        <w:rPr>
+          <w:rFonts w:ascii="Times New Roman" w:hAnsi="Times New Roman" w:cs="Times New Roman"/>
+          <w:sz w:val="24"/>
+          <w:szCs w:val="24"/>
+          <w:lang w:val="en-US"/>
+        </w:rPr>
+        <w:t>GitHub Repository Final Page:</w:t>
+      </w:r>
     </w:p>
     <w:p>
       <w:pPr>

</xml_diff>